<commit_message>
feat(auth): Implement login, password reset, and two-factor authentication functionality
- Added LoginController for user authentication with username and password.
- Created ResetPasswordController to handle password reset requests and token validation.
- Introduced TwoFactorSetupController for managing two-factor authentication setup.
- Developed PasswordResetLinkMail for sending password reset emails.
- Configured FortifyServiceProvider for custom authentication and view handling.
- Implemented LowStockService to monitor low stock products based on a global threshold.
- Added necessary migrations for user email, password resets, and two-factor authentication fields.
- Created views for login, password reset, two-factor challenge, and setup.
- Updated navigation partial to include user role and low stock notifications.
- Defined broadcasting channels and Fortify routes for two-factor authentication.
</commit_message>
<xml_diff>
--- a/laravel-prism-inventory/Project checklist.docx
+++ b/laravel-prism-inventory/Project checklist.docx
@@ -1302,8 +1302,14 @@
           <w:ilvl w:val="0"/>
           <w:numId w:val="17"/>
         </w:numPr>
-      </w:pPr>
-      <w:r>
+        <w:rPr>
+          <w:color w:val="C00000"/>
+        </w:rPr>
+      </w:pPr>
+      <w:r>
+        <w:rPr>
+          <w:color w:val="C00000"/>
+        </w:rPr>
         <w:t>Product notes and attachments</w:t>
       </w:r>
     </w:p>
@@ -1313,8 +1319,14 @@
           <w:ilvl w:val="0"/>
           <w:numId w:val="18"/>
         </w:numPr>
-      </w:pPr>
-      <w:r>
+        <w:rPr>
+          <w:color w:val="C00000"/>
+        </w:rPr>
+      </w:pPr>
+      <w:r>
+        <w:rPr>
+          <w:color w:val="C00000"/>
+        </w:rPr>
         <w:t>What: Users and admins add contextual notes to a product (e.g., “Supplier delayed”).</w:t>
       </w:r>
     </w:p>
@@ -1324,8 +1336,14 @@
           <w:ilvl w:val="0"/>
           <w:numId w:val="18"/>
         </w:numPr>
-      </w:pPr>
-      <w:r>
+        <w:rPr>
+          <w:color w:val="C00000"/>
+        </w:rPr>
+      </w:pPr>
+      <w:r>
+        <w:rPr>
+          <w:color w:val="C00000"/>
+        </w:rPr>
         <w:t>Table:</w:t>
       </w:r>
     </w:p>
@@ -1335,25 +1353,43 @@
           <w:ilvl w:val="1"/>
           <w:numId w:val="18"/>
         </w:numPr>
+        <w:rPr>
+          <w:color w:val="C00000"/>
+        </w:rPr>
       </w:pPr>
       <w:proofErr w:type="spellStart"/>
       <w:r>
+        <w:rPr>
+          <w:color w:val="C00000"/>
+        </w:rPr>
         <w:t>product_notes</w:t>
       </w:r>
       <w:proofErr w:type="spellEnd"/>
       <w:r>
+        <w:rPr>
+          <w:color w:val="C00000"/>
+        </w:rPr>
         <w:t xml:space="preserve">: id, </w:t>
       </w:r>
       <w:proofErr w:type="spellStart"/>
       <w:r>
+        <w:rPr>
+          <w:color w:val="C00000"/>
+        </w:rPr>
         <w:t>product_id</w:t>
       </w:r>
       <w:proofErr w:type="spellEnd"/>
       <w:r>
+        <w:rPr>
+          <w:color w:val="C00000"/>
+        </w:rPr>
         <w:t xml:space="preserve">, username, body, </w:t>
       </w:r>
       <w:proofErr w:type="spellStart"/>
       <w:r>
+        <w:rPr>
+          <w:color w:val="C00000"/>
+        </w:rPr>
         <w:t>created_at</w:t>
       </w:r>
       <w:proofErr w:type="spellEnd"/>
@@ -1364,8 +1400,14 @@
           <w:ilvl w:val="0"/>
           <w:numId w:val="18"/>
         </w:numPr>
-      </w:pPr>
-      <w:r>
+        <w:rPr>
+          <w:color w:val="C00000"/>
+        </w:rPr>
+      </w:pPr>
+      <w:r>
+        <w:rPr>
+          <w:color w:val="C00000"/>
+        </w:rPr>
         <w:t>Steps:</w:t>
       </w:r>
     </w:p>
@@ -1375,8 +1417,14 @@
           <w:ilvl w:val="1"/>
           <w:numId w:val="18"/>
         </w:numPr>
-      </w:pPr>
-      <w:r>
+        <w:rPr>
+          <w:color w:val="C00000"/>
+        </w:rPr>
+      </w:pPr>
+      <w:r>
+        <w:rPr>
+          <w:color w:val="C00000"/>
+        </w:rPr>
         <w:t>UI: product row “Notes” icon opens modal; show thread; add note.</w:t>
       </w:r>
     </w:p>
@@ -1386,8 +1434,14 @@
           <w:ilvl w:val="1"/>
           <w:numId w:val="18"/>
         </w:numPr>
-      </w:pPr>
-      <w:r>
+        <w:rPr>
+          <w:color w:val="C00000"/>
+        </w:rPr>
+      </w:pPr>
+      <w:r>
+        <w:rPr>
+          <w:color w:val="C00000"/>
+        </w:rPr>
         <w:t>Logs: “note added” with snippet.</w:t>
       </w:r>
     </w:p>
@@ -1397,7 +1451,15 @@
       </w:r>
     </w:p>
     <w:p>
-      <w:r>
+      <w:pPr>
+        <w:rPr>
+          <w:color w:val="C00000"/>
+        </w:rPr>
+      </w:pPr>
+      <w:r>
+        <w:rPr>
+          <w:color w:val="C00000"/>
+        </w:rPr>
         <w:t>11) Real-time low-stock alerts (in-app)</w:t>
       </w:r>
     </w:p>
@@ -1407,8 +1469,14 @@
           <w:ilvl w:val="0"/>
           <w:numId w:val="19"/>
         </w:numPr>
-      </w:pPr>
-      <w:r>
+        <w:rPr>
+          <w:color w:val="C00000"/>
+        </w:rPr>
+      </w:pPr>
+      <w:r>
+        <w:rPr>
+          <w:color w:val="C00000"/>
+        </w:rPr>
         <w:t>What: Notify online admins/users when a product falls below threshold.</w:t>
       </w:r>
     </w:p>
@@ -1418,8 +1486,14 @@
           <w:ilvl w:val="0"/>
           <w:numId w:val="19"/>
         </w:numPr>
-      </w:pPr>
-      <w:r>
+        <w:rPr>
+          <w:color w:val="C00000"/>
+        </w:rPr>
+      </w:pPr>
+      <w:r>
+        <w:rPr>
+          <w:color w:val="C00000"/>
+        </w:rPr>
         <w:t>Steps:</w:t>
       </w:r>
     </w:p>
@@ -1429,16 +1503,28 @@
           <w:ilvl w:val="1"/>
           <w:numId w:val="19"/>
         </w:numPr>
-      </w:pPr>
-      <w:r>
+        <w:rPr>
+          <w:color w:val="C00000"/>
+        </w:rPr>
+      </w:pPr>
+      <w:r>
+        <w:rPr>
+          <w:color w:val="C00000"/>
+        </w:rPr>
         <w:t>Use Laravel events to broadcast low-stock events (pusher/</w:t>
       </w:r>
       <w:proofErr w:type="spellStart"/>
       <w:r>
+        <w:rPr>
+          <w:color w:val="C00000"/>
+        </w:rPr>
         <w:t>laravel</w:t>
       </w:r>
       <w:proofErr w:type="spellEnd"/>
       <w:r>
+        <w:rPr>
+          <w:color w:val="C00000"/>
+        </w:rPr>
         <w:t>-echo or Laravel Reverb).</w:t>
       </w:r>
     </w:p>
@@ -1448,8 +1534,14 @@
           <w:ilvl w:val="1"/>
           <w:numId w:val="19"/>
         </w:numPr>
-      </w:pPr>
-      <w:r>
+        <w:rPr>
+          <w:color w:val="C00000"/>
+        </w:rPr>
+      </w:pPr>
+      <w:r>
+        <w:rPr>
+          <w:color w:val="C00000"/>
+        </w:rPr>
         <w:t>In the UI, show a toast + badge count in navbar.</w:t>
       </w:r>
     </w:p>
@@ -1753,7 +1845,12 @@
     </w:p>
     <w:p>
       <w:r>
-        <w:t>Phase 6 — Admin controls and security 16) Permission matrix (beyond admin/user)</w:t>
+        <w:t xml:space="preserve">Phase 6 — Admin controls and security </w:t>
+      </w:r>
+    </w:p>
+    <w:p>
+      <w:r>
+        <w:t>16) Permission matrix (beyond admin/user)</w:t>
       </w:r>
     </w:p>
     <w:p>
@@ -1822,8 +1919,18 @@
           <w:ilvl w:val="0"/>
           <w:numId w:val="28"/>
         </w:numPr>
-      </w:pPr>
-      <w:r>
+        <w:rPr>
+          <w:b/>
+          <w:bCs/>
+          <w:color w:val="C00000"/>
+        </w:rPr>
+      </w:pPr>
+      <w:r>
+        <w:rPr>
+          <w:b/>
+          <w:bCs/>
+          <w:color w:val="C00000"/>
+        </w:rPr>
         <w:t>Account security</w:t>
       </w:r>
     </w:p>
@@ -1833,8 +1940,18 @@
           <w:ilvl w:val="0"/>
           <w:numId w:val="29"/>
         </w:numPr>
-      </w:pPr>
-      <w:r>
+        <w:rPr>
+          <w:b/>
+          <w:bCs/>
+          <w:color w:val="C00000"/>
+        </w:rPr>
+      </w:pPr>
+      <w:r>
+        <w:rPr>
+          <w:b/>
+          <w:bCs/>
+          <w:color w:val="C00000"/>
+        </w:rPr>
         <w:t>What: Forgot password, email verification, optional 2FA (Fortify).</w:t>
       </w:r>
     </w:p>
@@ -1844,8 +1961,18 @@
           <w:ilvl w:val="0"/>
           <w:numId w:val="29"/>
         </w:numPr>
-      </w:pPr>
-      <w:r>
+        <w:rPr>
+          <w:b/>
+          <w:bCs/>
+          <w:color w:val="C00000"/>
+        </w:rPr>
+      </w:pPr>
+      <w:r>
+        <w:rPr>
+          <w:b/>
+          <w:bCs/>
+          <w:color w:val="C00000"/>
+        </w:rPr>
         <w:t>Steps:</w:t>
       </w:r>
     </w:p>
@@ -1855,8 +1982,18 @@
           <w:ilvl w:val="1"/>
           <w:numId w:val="29"/>
         </w:numPr>
-      </w:pPr>
-      <w:r>
+        <w:rPr>
+          <w:b/>
+          <w:bCs/>
+          <w:color w:val="C00000"/>
+        </w:rPr>
+      </w:pPr>
+      <w:r>
+        <w:rPr>
+          <w:b/>
+          <w:bCs/>
+          <w:color w:val="C00000"/>
+        </w:rPr>
         <w:t>Add email to users (nullable initially).</w:t>
       </w:r>
     </w:p>
@@ -1866,8 +2003,18 @@
           <w:ilvl w:val="1"/>
           <w:numId w:val="29"/>
         </w:numPr>
-      </w:pPr>
-      <w:r>
+        <w:rPr>
+          <w:b/>
+          <w:bCs/>
+          <w:color w:val="C00000"/>
+        </w:rPr>
+      </w:pPr>
+      <w:r>
+        <w:rPr>
+          <w:b/>
+          <w:bCs/>
+          <w:color w:val="C00000"/>
+        </w:rPr>
         <w:t>Forgot password flow (separate table).</w:t>
       </w:r>
     </w:p>
@@ -1877,8 +2024,18 @@
           <w:ilvl w:val="1"/>
           <w:numId w:val="29"/>
         </w:numPr>
-      </w:pPr>
-      <w:r>
+        <w:rPr>
+          <w:b/>
+          <w:bCs/>
+          <w:color w:val="C00000"/>
+        </w:rPr>
+      </w:pPr>
+      <w:r>
+        <w:rPr>
+          <w:b/>
+          <w:bCs/>
+          <w:color w:val="C00000"/>
+        </w:rPr>
         <w:t>Optional TOTP-based MFA for admins.</w:t>
       </w:r>
     </w:p>
@@ -1963,7 +2120,12 @@
     </w:p>
     <w:p>
       <w:r>
-        <w:t>Phase 7 — API and integrations 19) Read-only API for products and logs</w:t>
+        <w:t xml:space="preserve">Phase 7 — API and integrations </w:t>
+      </w:r>
+    </w:p>
+    <w:p>
+      <w:r>
+        <w:t>19) Read-only API for products and logs</w:t>
       </w:r>
     </w:p>
     <w:p>
@@ -2099,7 +2261,12 @@
     </w:p>
     <w:p>
       <w:r>
-        <w:t>Phase 8 — Quality, performance, ops 21) Indexes and performance</w:t>
+        <w:t xml:space="preserve">Phase 8 — Quality, performance, ops </w:t>
+      </w:r>
+    </w:p>
+    <w:p>
+      <w:r>
+        <w:t>21) Indexes and performance</w:t>
       </w:r>
     </w:p>
     <w:p>
@@ -2208,6 +2375,7 @@
         </w:numPr>
       </w:pPr>
       <w:r>
+        <w:lastRenderedPageBreak/>
         <w:t>What:</w:t>
       </w:r>
     </w:p>
@@ -2241,7 +2409,6 @@
         </w:numPr>
       </w:pPr>
       <w:r>
-        <w:lastRenderedPageBreak/>
         <w:t>Steps:</w:t>
       </w:r>
     </w:p>
@@ -9082,6 +9249,7 @@
   <w:style w:type="character" w:default="1" w:styleId="DefaultParagraphFont">
     <w:name w:val="Default Paragraph Font"/>
     <w:uiPriority w:val="1"/>
+    <w:semiHidden/>
     <w:unhideWhenUsed/>
   </w:style>
   <w:style w:type="table" w:default="1" w:styleId="TableNormal">

</xml_diff>